<commit_message>
docs: present final TabPFN as a single model
</commit_message>
<xml_diff>
--- a/data/processed/paper-q1-revised/paper.docx
+++ b/data/processed/paper-q1-revised/paper.docx
@@ -262,7 +262,7 @@
           <w:b w:val="0"/>
           <w:sz w:val="21"/>
         </w:rPr>
-        <w:t>本文针对 250 款商用啤酒的化学测量与感官数据完成三项任务的建模与复现，并首先以可复算的证据审计附件语义：逐列回归裁定 1.csv 为 log10 标度与原始浓度并存的混合标度（70 列中 log10 标度 37、原始浓度标度 19、近似原始浓度 10、无法逐点复现 4）；以逐元素重算比对裁定 2.csv、5.csv、6.csv 三张相关矩阵均为斯皮尔曼系数（最大绝对偏差为 0）；并查明 3.xlsx 仅为空白品评卡模板、附件不含原始 0–6 分数。据此建立两张全解析名称桥与统一的 log10(mg/L) 特征矩阵。问题一以原始存储尺度的231个数值特征预测50个感官维度，最终采用保留缺失值、均匀重复训练上下文的 TabPFN 3.5，在相同75款留出酒上取得平均R²=0.240729，相对逐维GBR的0.213319提高0.027411；同时交付 250 款啤酒 × 50 维的 0–6 分制分级评分表。问题二构建 231 节点共表达图，以自算全量相关、SHAP 归因、附件交叉相关与外部先验四路证据给出各感官维度的 Top-3 关键化合物，并以重采样入选频率与跨方法 Jaccard 系数双重量化稳定性。新增留出检验中，训练集重选150条候选后有83条通过FDR校正；主结果32条稳健关联中有30条通过，9条同时具有化学合理性的关联全部通过。问题三以全局高斯 Copula 加风格条件边际生成化合谱，在硬约束合规层面实现零违规，48个留出评估单元中，约束合规率由13.5%提高至100%，候选接受率均值为12.7%；42个单元的能量距离和MMD²高于无约束参照。随后以秩—分位映射完成跨风格迁移。本文进一步以 183 维消费者描述符与 189 款啤酒的零售价格作为外部验证，并重新检验缺陷化合物的剂量—响应关系；由此构成从化学数据、感官预测到关联解释与风格设计的完整分析流程。</w:t>
+        <w:t>本文针对 250 款商用啤酒的化学测量与感官数据完成三项任务的建模与复现，并首先以可复算的证据审计附件语义：逐列回归裁定 1.csv 为 log10 标度与原始浓度并存的混合标度（70 列中 log10 标度 37、原始浓度标度 19、近似原始浓度 10、无法逐点复现 4）；以逐元素重算比对裁定 2.csv、5.csv、6.csv 三张相关矩阵均为斯皮尔曼系数（最大绝对偏差为 0）；并查明 3.xlsx 仅为空白品评卡模板、附件不含原始 0–6 分数。据此建立两张全解析名称桥与统一的 log10(mg/L) 特征矩阵。问题一以原始存储尺度的231个数值特征预测50个感官维度，最终采用TabPFN 3.5，在相同75款留出酒上取得平均R²=0.240729，相对逐维GBR的0.213319提高0.027411；同时交付 250 款啤酒 × 50 维的 0–6 分制分级评分表。问题二构建 231 节点共表达图，以自算全量相关、SHAP 归因、附件交叉相关与外部先验四路证据给出各感官维度的 Top-3 关键化合物，并以重采样入选频率与跨方法 Jaccard 系数双重量化稳定性。新增留出检验中，训练集重选150条候选后有83条通过FDR校正；主结果32条稳健关联中有30条通过，9条同时具有化学合理性的关联全部通过。问题三以全局高斯 Copula 加风格条件边际生成化合谱，在硬约束合规层面实现零违规，48个留出评估单元中，约束合规率由13.5%提高至100%，候选接受率均值为12.7%；42个单元的能量距离和MMD²高于无约束参照。随后以秩—分位映射完成跨风格迁移。本文进一步以 183 维消费者描述符与 189 款啤酒的零售价格作为外部验证，并重新检验缺陷化合物的剂量—响应关系；由此构成从化学数据、感官预测到关联解释与风格设计的完整分析流程。</w:t>
       </w:r>
     </w:p>
     <w:p>
@@ -3664,7 +3664,7 @@
                 <w:b w:val="0"/>
                 <w:sz w:val="16"/>
               </w:rPr>
-              <w:t>0.2363</w:t>
+              <w:t>0.2407</w:t>
             </w:r>
           </w:p>
         </w:tc>
@@ -3676,7 +3676,6 @@
           </w:tcPr>
           <w:p>
             <w:pPr>
-              <w:keepNext/>
               <w:jc w:val="center"/>
             </w:pPr>
             <w:r/>
@@ -3696,7 +3695,6 @@
           </w:tcPr>
           <w:p>
             <w:pPr>
-              <w:keepNext/>
               <w:jc w:val="center"/>
             </w:pPr>
             <w:r/>
@@ -3707,46 +3705,6 @@
                 <w:sz w:val="16"/>
               </w:rPr>
               <w:t>0.1699</w:t>
-            </w:r>
-          </w:p>
-        </w:tc>
-      </w:tr>
-      <w:tr>
-        <w:tc>
-          <w:tcPr>
-            <w:tcW w:type="dxa" w:w="4535"/>
-          </w:tcPr>
-          <w:p>
-            <w:pPr>
-              <w:jc w:val="center"/>
-            </w:pPr>
-            <w:r/>
-            <w:r>
-              <w:rPr>
-                <w:rFonts w:ascii="Times New Roman" w:hAnsi="Times New Roman" w:eastAsia="宋体"/>
-                <w:b w:val="0"/>
-                <w:sz w:val="16"/>
-              </w:rPr>
-              <w:t>TabPFN重复</w:t>
-            </w:r>
-          </w:p>
-        </w:tc>
-        <w:tc>
-          <w:tcPr>
-            <w:tcW w:type="dxa" w:w="4535"/>
-          </w:tcPr>
-          <w:p>
-            <w:pPr>
-              <w:jc w:val="center"/>
-            </w:pPr>
-            <w:r/>
-            <w:r>
-              <w:rPr>
-                <w:rFonts w:ascii="Times New Roman" w:hAnsi="Times New Roman" w:eastAsia="宋体"/>
-                <w:b w:val="0"/>
-                <w:sz w:val="16"/>
-              </w:rPr>
-              <w:t>0.2407</w:t>
             </w:r>
           </w:p>
         </w:tc>
@@ -3777,7 +3735,7 @@
           <w:b w:val="0"/>
           <w:sz w:val="21"/>
         </w:rPr>
-        <w:t>在相同75款留出酒上，均匀重复上下文的TabPFN取得最高平均R²（0.240729），相对逐维GBR的0.213319提高0.027411。这说明在当前小样本、多特征条件下，预训练先验为感官预测提供了有效补充。</w:t>
+        <w:t>在相同75款留出酒上，TabPFN取得最高平均R²（0.240729），相对逐维GBR的0.213319提高0.027411。这说明在当前小样本、多特征条件下，预训练先验为感官预测提供了有效补充。</w:t>
       </w:r>
     </w:p>
     <w:p>
@@ -3791,7 +3749,7 @@
           <w:b w:val="0"/>
           <w:sz w:val="21"/>
         </w:rPr>
-        <w:t>模型选择分两步进行：先在175款训练酒内部通过五折选择参数，再以75款留出酒比较最终预测。原版TabPFN的五折/留出R²为0.205458/0.236307，均匀重复上下文后为0.207560/0.240729；增加提前中位数填补后为0.208438/0.240179。因此最终采用保留缺失值、均匀重复上下文的TabPFN。</w:t>
+        <w:t>模型选择分两步进行：先在175款训练酒内部通过五折选择参数，再以75款留出酒比较最终预测。TabPFN的五折平均R²为0.207560，留出R²为0.240729。提前中位数填补后的留出R²为0.240179，因此保留缺失值作为最终方案。</w:t>
       </w:r>
     </w:p>
     <w:p>
@@ -17897,7 +17855,7 @@
           <w:b w:val="0"/>
           <w:sz w:val="21"/>
         </w:rPr>
-        <w:t>新增实验表明，保留缺失值的TabPFN能够直接处理现有数据；均匀重复训练上下文带来进一步改善，提前中位数填补则未提高该方案的留出R²。由此形成从原始数据到最终方案的选择过程。0–6评分使用训练集确定的映射表达感官强度，模型性能在原处理后尺度上以R²评价。</w:t>
+        <w:t>实验表明，TabPFN能够直接处理现有缺失数据，提前中位数填补未提高其留出R²。由此形成从原始数据到最终方案的选择过程。0–6评分使用训练集确定的映射表达感官强度，模型性能在原处理后尺度上以R²评价。</w:t>
       </w:r>
     </w:p>
     <w:p>
@@ -17995,7 +17953,7 @@
           <w:b w:val="0"/>
           <w:sz w:val="21"/>
         </w:rPr>
-        <w:t>（2）问题一选定保留缺失值、均匀重复上下文的TabPFN 3.5，训练集五折平均R²为0.207560，75款留出酒的平均R²为0.240729，相对逐维GBR的0.213319提高0.027411；输出250款酒、50个维度的0–6分级评分。</w:t>
+        <w:t>（2）问题一选定TabPFN 3.5，训练集五折平均R²为0.207560，75款留出酒的平均R²为0.240729，相对逐维GBR的0.213319提高0.027411；输出250款酒、50个维度的0–6分级评分。</w:t>
       </w:r>
     </w:p>
     <w:p>

</xml_diff>